<commit_message>
created skill for new slide development
</commit_message>
<xml_diff>
--- a/2026-05-15_Alabama_script.docx
+++ b/2026-05-15_Alabama_script.docx
@@ -497,7 +497,7 @@
         <w:t>Advisor quality</w:t>
       </w:r>
       <w:r>
-        <w:t>. A  supportive advisor is perhaps the most crucial element in student progress and well-being. However, advising practices vary significantly and are not often institutionally rewarded, leaving students in a precarious position without clear guidelines to navigate challenges.</w:t>
+        <w:t>. A supportive advisor is perhaps the most crucial element in student progress and well-being. However, advising practices vary significantly and are not often institutionally rewarded, leaving students in a precarious position without clear guidelines to navigate challenges.</w:t>
       </w:r>
     </w:p>
     <w:p>
@@ -1422,315 +1422,6 @@
         </w:rPr>
       </w:pPr>
     </w:p>
-    <w:p>
-      <w:pPr>
-        <w:rPr>
-          <w:b/>
-          <w:bCs/>
-        </w:rPr>
-      </w:pPr>
-    </w:p>
-    <w:p>
-      <w:pPr>
-        <w:rPr>
-          <w:b/>
-          <w:bCs/>
-        </w:rPr>
-      </w:pPr>
-      <w:r>
-        <w:rPr>
-          <w:b/>
-          <w:bCs/>
-        </w:rPr>
-        <w:t xml:space="preserve">[move to faculty workshop?] </w:t>
-      </w:r>
-      <w:r>
-        <w:rPr>
-          <w:b/>
-          <w:bCs/>
-        </w:rPr>
-        <w:t>- Where to begin</w:t>
-      </w:r>
-    </w:p>
-    <w:p/>
-    <w:p>
-      <w:r>
-        <w:t>When you're trying to move in new directions, it can be hard to know where to put your energy. Here are some key focal points:</w:t>
-      </w:r>
-    </w:p>
-    <w:p>
-      <w:pPr>
-        <w:ind w:left="720"/>
-      </w:pPr>
-    </w:p>
-    <w:p>
-      <w:pPr>
-        <w:numPr>
-          <w:ilvl w:val="0"/>
-          <w:numId w:val="5"/>
-        </w:numPr>
-      </w:pPr>
-      <w:r>
-        <w:t>Assess what's working for you and what's not. What sparks joy? What leaves you feeling drained? You might try building a reflective habit into your schedule: at the end of each week, look back over your calendar, and make note of how different things affected you. These questions might guide your thinking:</w:t>
-      </w:r>
-    </w:p>
-    <w:p>
-      <w:pPr>
-        <w:numPr>
-          <w:ilvl w:val="1"/>
-          <w:numId w:val="5"/>
-        </w:numPr>
-      </w:pPr>
-      <w:r>
-        <w:t>Which meetings do I leave feeling inspired versus depleted?</w:t>
-      </w:r>
-    </w:p>
-    <w:p>
-      <w:pPr>
-        <w:numPr>
-          <w:ilvl w:val="1"/>
-          <w:numId w:val="5"/>
-        </w:numPr>
-      </w:pPr>
-      <w:r>
-        <w:t>What types of problems am I naturally drawn to solve?</w:t>
-      </w:r>
-    </w:p>
-    <w:p>
-      <w:pPr>
-        <w:numPr>
-          <w:ilvl w:val="1"/>
-          <w:numId w:val="5"/>
-        </w:numPr>
-      </w:pPr>
-      <w:r>
-        <w:t>When do I feel most confident and competent in my contributions?</w:t>
-      </w:r>
-    </w:p>
-    <w:p>
-      <w:pPr>
-        <w:numPr>
-          <w:ilvl w:val="1"/>
-          <w:numId w:val="5"/>
-        </w:numPr>
-      </w:pPr>
-      <w:r>
-        <w:t>What work feels meaningful enough that I'd do it even if it weren't required?</w:t>
-      </w:r>
-    </w:p>
-    <w:p>
-      <w:pPr>
-        <w:numPr>
-          <w:ilvl w:val="1"/>
-          <w:numId w:val="5"/>
-        </w:numPr>
-      </w:pPr>
-      <w:r>
-        <w:t>Which collaborations bring out my best thinking?</w:t>
-      </w:r>
-    </w:p>
-    <w:p>
-      <w:r>
-        <w:t>Watch for patterns to emerge; it will help you have a sense of the kinds of things you want to do more of over time.</w:t>
-      </w:r>
-    </w:p>
-    <w:p>
-      <w:pPr>
-        <w:ind w:left="720"/>
-      </w:pPr>
-    </w:p>
-    <w:p>
-      <w:pPr>
-        <w:numPr>
-          <w:ilvl w:val="0"/>
-          <w:numId w:val="5"/>
-        </w:numPr>
-      </w:pPr>
-      <w:r>
-        <w:t>Build relationships and learn the landscape</w:t>
-      </w:r>
-    </w:p>
-    <w:p>
-      <w:pPr>
-        <w:numPr>
-          <w:ilvl w:val="1"/>
-          <w:numId w:val="5"/>
-        </w:numPr>
-      </w:pPr>
-      <w:r>
-        <w:t xml:space="preserve">I don't like to think about this as networking, which implies a transaction. Building real relationships starts with curiosity and interest, no matter what might emerge later on. It's so important to listen into conversations happening in spaces that you think you might be drawn to. Every collaboration, every social connection, every conference chat is an opportunity to strengthen your relationships so that you </w:t>
-      </w:r>
-      <w:r>
-        <w:lastRenderedPageBreak/>
-        <w:t>have a clearer picture of the terrain.</w:t>
-      </w:r>
-      <w:r>
-        <w:br/>
-      </w:r>
-    </w:p>
-    <w:p>
-      <w:pPr>
-        <w:numPr>
-          <w:ilvl w:val="0"/>
-          <w:numId w:val="5"/>
-        </w:numPr>
-      </w:pPr>
-      <w:r>
-        <w:t>Seek out resources before you need them</w:t>
-      </w:r>
-    </w:p>
-    <w:p>
-      <w:pPr>
-        <w:numPr>
-          <w:ilvl w:val="1"/>
-          <w:numId w:val="5"/>
-        </w:numPr>
-      </w:pPr>
-      <w:r>
-        <w:t xml:space="preserve">It's never too late to look for resources — but it's never too early, either. Everyone's path is individual, so I don't pretend to know exactly what you need in this moment, but I do have a number of resources that I recommend for reflection, discovery, and career support. No matter what, get to know the graduate career center so that you have someone in your corner when you're ready to start a job search. I've gathered some of my favorites at </w:t>
-      </w:r>
-      <w:commentRangeStart w:id="4"/>
-      <w:r>
-        <w:fldChar w:fldCharType="begin"/>
-      </w:r>
-      <w:r>
-        <w:instrText>HYPERLINK "http://bit.ly/inkcap-resources" \h</w:instrText>
-      </w:r>
-      <w:r>
-        <w:fldChar w:fldCharType="separate"/>
-      </w:r>
-      <w:r>
-        <w:rPr>
-          <w:color w:val="1155CC"/>
-          <w:u w:val="single"/>
-        </w:rPr>
-        <w:t>bit.ly/inkcap-resources</w:t>
-      </w:r>
-      <w:r>
-        <w:fldChar w:fldCharType="end"/>
-      </w:r>
-      <w:r>
-        <w:t xml:space="preserve">. </w:t>
-      </w:r>
-      <w:commentRangeEnd w:id="4"/>
-      <w:r>
-        <w:rPr>
-          <w:rStyle w:val="CommentReference"/>
-          <w:sz w:val="22"/>
-          <w:szCs w:val="22"/>
-        </w:rPr>
-        <w:commentReference w:id="4"/>
-      </w:r>
-      <w:r>
-        <w:br/>
-      </w:r>
-    </w:p>
-    <w:p>
-      <w:pPr>
-        <w:numPr>
-          <w:ilvl w:val="0"/>
-          <w:numId w:val="5"/>
-        </w:numPr>
-      </w:pPr>
-      <w:r>
-        <w:t>Make a plan</w:t>
-      </w:r>
-    </w:p>
-    <w:p>
-      <w:pPr>
-        <w:numPr>
-          <w:ilvl w:val="1"/>
-          <w:numId w:val="5"/>
-        </w:numPr>
-      </w:pPr>
-      <w:r>
-        <w:t>Whether you're actively job searching or just starting to explore, it's a good idea to set some goals for yourself — as well as some limits. Maybe it's hard for you to reach out to people, so you decide to contact a certain number of people per week or month. Or maybe you know you can easily get sucked in, and you don't want to spend more than a certain amount of time per week looking at job postings. A plan can help you feel more in control of a process that can be overwhelming.</w:t>
-      </w:r>
-      <w:r>
-        <w:br/>
-      </w:r>
-    </w:p>
-    <w:p>
-      <w:pPr>
-        <w:numPr>
-          <w:ilvl w:val="0"/>
-          <w:numId w:val="5"/>
-        </w:numPr>
-      </w:pPr>
-      <w:r>
-        <w:t>Put yourself out there!</w:t>
-      </w:r>
-    </w:p>
-    <w:p>
-      <w:pPr>
-        <w:numPr>
-          <w:ilvl w:val="1"/>
-          <w:numId w:val="5"/>
-        </w:numPr>
-      </w:pPr>
-      <w:r>
-        <w:t>Risk-taking is a big part of this. Rejection happens to everyone — a lot. I have folders filled with job applications that never panned out, with op-eds that I pitched but couldn't place, with grant proposals that didn't get funded. The more you try, the more likely you are to succeed.</w:t>
-      </w:r>
-      <w:r>
-        <w:br/>
-      </w:r>
-    </w:p>
-    <w:p>
-      <w:pPr>
-        <w:numPr>
-          <w:ilvl w:val="0"/>
-          <w:numId w:val="5"/>
-        </w:numPr>
-      </w:pPr>
-      <w:r>
-        <w:t>Take time to reflect</w:t>
-      </w:r>
-    </w:p>
-    <w:p>
-      <w:pPr>
-        <w:numPr>
-          <w:ilvl w:val="1"/>
-          <w:numId w:val="5"/>
-        </w:numPr>
-      </w:pPr>
-      <w:r>
-        <w:t xml:space="preserve">Don't forget to pause during the process to think about what's working, and what isn't. </w:t>
-      </w:r>
-      <w:r>
-        <w:br/>
-      </w:r>
-    </w:p>
-    <w:p>
-      <w:pPr>
-        <w:numPr>
-          <w:ilvl w:val="0"/>
-          <w:numId w:val="5"/>
-        </w:numPr>
-      </w:pPr>
-      <w:r>
-        <w:t xml:space="preserve">Repeat. </w:t>
-      </w:r>
-    </w:p>
-    <w:p>
-      <w:pPr>
-        <w:numPr>
-          <w:ilvl w:val="1"/>
-          <w:numId w:val="5"/>
-        </w:numPr>
-      </w:pPr>
-      <w:r>
-        <w:t>You'll likely cycle through this process many times, and that's completely normal! It's a set of skills you'll continue to draw on throughout your career.</w:t>
-      </w:r>
-    </w:p>
-    <w:p>
-      <w:pPr>
-        <w:rPr>
-          <w:b/>
-          <w:bCs/>
-        </w:rPr>
-      </w:pPr>
-    </w:p>
-    <w:p/>
     <w:p/>
     <w:sectPr>
       <w:pgSz w:w="12240" w:h="15840"/>
@@ -1808,38 +1499,6 @@
       </w:r>
     </w:p>
   </w:comment>
-  <w:comment w:id="4" w:author="Katina Rogers" w:date="2026-05-07T01:04:00Z" w:initials="">
-    <w:p>
-      <w:pPr>
-        <w:widowControl w:val="0"/>
-        <w:pBdr>
-          <w:top w:val="nil"/>
-          <w:left w:val="nil"/>
-          <w:bottom w:val="nil"/>
-          <w:right w:val="nil"/>
-          <w:between w:val="nil"/>
-        </w:pBdr>
-        <w:spacing w:line="240" w:lineRule="auto"/>
-        <w:rPr>
-          <w:rFonts w:ascii="Arial" w:eastAsia="Arial" w:hAnsi="Arial" w:cs="Arial"/>
-          <w:color w:val="000000"/>
-        </w:rPr>
-      </w:pPr>
-      <w:r>
-        <w:rPr>
-          <w:rStyle w:val="CommentReference"/>
-        </w:rPr>
-        <w:annotationRef/>
-      </w:r>
-      <w:r>
-        <w:rPr>
-          <w:rFonts w:ascii="Arial" w:eastAsia="Arial" w:hAnsi="Arial" w:cs="Arial"/>
-          <w:color w:val="000000"/>
-        </w:rPr>
-        <w:t>add QR code</w:t>
-      </w:r>
-    </w:p>
-  </w:comment>
 </w:comments>
 </file>
 
@@ -1847,7 +1506,6 @@
 <w15:commentsEx xmlns:wpc="http://schemas.microsoft.com/office/word/2010/wordprocessingCanvas" xmlns:cx="http://schemas.microsoft.com/office/drawing/2014/chartex" xmlns:cx1="http://schemas.microsoft.com/office/drawing/2015/9/8/chartex" xmlns:cx2="http://schemas.microsoft.com/office/drawing/2015/10/21/chartex" xmlns:cx3="http://schemas.microsoft.com/office/drawing/2016/5/9/chartex" xmlns:cx4="http://schemas.microsoft.com/office/drawing/2016/5/10/chartex" xmlns:cx5="http://schemas.microsoft.com/office/drawing/2016/5/11/chartex" xmlns:cx6="http://schemas.microsoft.com/office/drawing/2016/5/12/chartex" xmlns:cx7="http://schemas.microsoft.com/office/drawing/2016/5/13/chartex" xmlns:cx8="http://schemas.microsoft.com/office/drawing/2016/5/14/chartex" xmlns:mc="http://schemas.openxmlformats.org/markup-compatibility/2006" xmlns:aink="http://schemas.microsoft.com/office/drawing/2016/ink" xmlns:am3d="http://schemas.microsoft.com/office/drawing/2017/model3d" xmlns:o="urn:schemas-microsoft-com:office:office" xmlns:oel="http://schemas.microsoft.com/office/2019/extlst" xmlns:r="http://schemas.openxmlformats.org/officeDocument/2006/relationships" xmlns:m="http://schemas.openxmlformats.org/officeDocument/2006/math" xmlns:v="urn:schemas-microsoft-com:vml" xmlns:wp14="http://schemas.microsoft.com/office/word/2010/wordprocessingDrawing" xmlns:wp="http://schemas.openxmlformats.org/drawingml/2006/wordprocessingDrawing" xmlns:w10="urn:schemas-microsoft-com:office:word" xmlns:w="http://schemas.openxmlformats.org/wordprocessingml/2006/main" xmlns:w14="http://schemas.microsoft.com/office/word/2010/wordml" xmlns:w15="http://schemas.microsoft.com/office/word/2012/wordml" xmlns:w16cex="http://schemas.microsoft.com/office/word/2018/wordml/cex" xmlns:w16cid="http://schemas.microsoft.com/office/word/2016/wordml/cid" xmlns:w16="http://schemas.microsoft.com/office/word/2018/wordml" xmlns:w16du="http://schemas.microsoft.com/office/word/2023/wordml/word16du" xmlns:w16sdtdh="http://schemas.microsoft.com/office/word/2020/wordml/sdtdatahash" xmlns:w16sdtfl="http://schemas.microsoft.com/office/word/2024/wordml/sdtformatlock" xmlns:w16se="http://schemas.microsoft.com/office/word/2015/wordml/symex" xmlns:wpg="http://schemas.microsoft.com/office/word/2010/wordprocessingGroup" xmlns:wpi="http://schemas.microsoft.com/office/word/2010/wordprocessingInk" xmlns:wne="http://schemas.microsoft.com/office/word/2006/wordml" xmlns:wps="http://schemas.microsoft.com/office/word/2010/wordprocessingShape" mc:Ignorable="w14 w15 w16se w16cid w16 w16cex w16sdtdh w16sdtfl w16du wp14">
   <w15:commentEx w15:paraId="0000009C" w15:done="0"/>
   <w15:commentEx w15:paraId="00000097" w15:done="0"/>
-  <w15:commentEx w15:paraId="00000099" w15:done="0"/>
 </w15:commentsEx>
 </file>
 
@@ -1855,7 +1513,6 @@
 <w16cid:commentsIds xmlns:wpc="http://schemas.microsoft.com/office/word/2010/wordprocessingCanvas" xmlns:cx="http://schemas.microsoft.com/office/drawing/2014/chartex" xmlns:cx1="http://schemas.microsoft.com/office/drawing/2015/9/8/chartex" xmlns:cx2="http://schemas.microsoft.com/office/drawing/2015/10/21/chartex" xmlns:cx3="http://schemas.microsoft.com/office/drawing/2016/5/9/chartex" xmlns:cx4="http://schemas.microsoft.com/office/drawing/2016/5/10/chartex" xmlns:cx5="http://schemas.microsoft.com/office/drawing/2016/5/11/chartex" xmlns:cx6="http://schemas.microsoft.com/office/drawing/2016/5/12/chartex" xmlns:cx7="http://schemas.microsoft.com/office/drawing/2016/5/13/chartex" xmlns:cx8="http://schemas.microsoft.com/office/drawing/2016/5/14/chartex" xmlns:mc="http://schemas.openxmlformats.org/markup-compatibility/2006" xmlns:aink="http://schemas.microsoft.com/office/drawing/2016/ink" xmlns:am3d="http://schemas.microsoft.com/office/drawing/2017/model3d" xmlns:o="urn:schemas-microsoft-com:office:office" xmlns:oel="http://schemas.microsoft.com/office/2019/extlst" xmlns:r="http://schemas.openxmlformats.org/officeDocument/2006/relationships" xmlns:m="http://schemas.openxmlformats.org/officeDocument/2006/math" xmlns:v="urn:schemas-microsoft-com:vml" xmlns:wp14="http://schemas.microsoft.com/office/word/2010/wordprocessingDrawing" xmlns:wp="http://schemas.openxmlformats.org/drawingml/2006/wordprocessingDrawing" xmlns:w10="urn:schemas-microsoft-com:office:word" xmlns:w="http://schemas.openxmlformats.org/wordprocessingml/2006/main" xmlns:w14="http://schemas.microsoft.com/office/word/2010/wordml" xmlns:w15="http://schemas.microsoft.com/office/word/2012/wordml" xmlns:w16cex="http://schemas.microsoft.com/office/word/2018/wordml/cex" xmlns:w16cid="http://schemas.microsoft.com/office/word/2016/wordml/cid" xmlns:w16="http://schemas.microsoft.com/office/word/2018/wordml" xmlns:w16du="http://schemas.microsoft.com/office/word/2023/wordml/word16du" xmlns:w16sdtdh="http://schemas.microsoft.com/office/word/2020/wordml/sdtdatahash" xmlns:w16sdtfl="http://schemas.microsoft.com/office/word/2024/wordml/sdtformatlock" xmlns:w16se="http://schemas.microsoft.com/office/word/2015/wordml/symex" xmlns:wpg="http://schemas.microsoft.com/office/word/2010/wordprocessingGroup" xmlns:wpi="http://schemas.microsoft.com/office/word/2010/wordprocessingInk" xmlns:wne="http://schemas.microsoft.com/office/word/2006/wordml" xmlns:wps="http://schemas.microsoft.com/office/word/2010/wordprocessingShape" mc:Ignorable="w14 w15 w16se w16cid w16 w16cex w16sdtdh w16sdtfl w16du wp14">
   <w16cid:commentId w16cid:paraId="0000009C" w16cid:durableId="0000009C"/>
   <w16cid:commentId w16cid:paraId="00000097" w16cid:durableId="00000097"/>
-  <w16cid:commentId w16cid:paraId="00000099" w16cid:durableId="00000099"/>
 </w16cid:commentsIds>
 </file>
 

</xml_diff>